<commit_message>
feat: ajustar logo en analytica
</commit_message>
<xml_diff>
--- a/fiscalizacion/analytica/Report/PrintValorizacion.docx
+++ b/fiscalizacion/analytica/Report/PrintValorizacion.docx
@@ -1,6 +1,6 @@
 
 <file path=word/document.xml><?xml version="1.0" encoding="utf-8"?>
-<w:document xmlns:wpc="http://schemas.microsoft.com/office/word/2010/wordprocessingCanvas" xmlns:cx="http://schemas.microsoft.com/office/drawing/2014/chartex" xmlns:cx1="http://schemas.microsoft.com/office/drawing/2015/9/8/chartex" xmlns:cx2="http://schemas.microsoft.com/office/drawing/2015/10/21/chartex" xmlns:cx3="http://schemas.microsoft.com/office/drawing/2016/5/9/chartex" xmlns:cx4="http://schemas.microsoft.com/office/drawing/2016/5/10/chartex" xmlns:cx5="http://schemas.microsoft.com/office/drawing/2016/5/11/chartex" xmlns:cx6="http://schemas.microsoft.com/office/drawing/2016/5/12/chartex" xmlns:cx7="http://schemas.microsoft.com/office/drawing/2016/5/13/chartex" xmlns:cx8="http://schemas.microsoft.com/office/drawing/2016/5/14/chartex" xmlns:mc="http://schemas.openxmlformats.org/markup-compatibility/2006" xmlns:aink="http://schemas.microsoft.com/office/drawing/2016/ink" xmlns:am3d="http://schemas.microsoft.com/office/drawing/2017/model3d" xmlns:o="urn:schemas-microsoft-com:office:office" xmlns:oel="http://schemas.microsoft.com/office/2019/extlst" xmlns:r="http://schemas.openxmlformats.org/officeDocument/2006/relationships" xmlns:m="http://schemas.openxmlformats.org/officeDocument/2006/math" xmlns:v="urn:schemas-microsoft-com:vml" xmlns:wp14="http://schemas.microsoft.com/office/word/2010/wordprocessingDrawing" xmlns:wp="http://schemas.openxmlformats.org/drawingml/2006/wordprocessingDrawing" xmlns:w10="urn:schemas-microsoft-com:office:word" xmlns:w="http://schemas.openxmlformats.org/wordprocessingml/2006/main" xmlns:w14="http://schemas.microsoft.com/office/word/2010/wordml" xmlns:w15="http://schemas.microsoft.com/office/word/2012/wordml" xmlns:w16cex="http://schemas.microsoft.com/office/word/2018/wordml/cex" xmlns:w16cid="http://schemas.microsoft.com/office/word/2016/wordml/cid" xmlns:w16="http://schemas.microsoft.com/office/word/2018/wordml" xmlns:w16du="http://schemas.microsoft.com/office/word/2023/wordml/word16du" xmlns:w16sdtdh="http://schemas.microsoft.com/office/word/2020/wordml/sdtdatahash" xmlns:w16se="http://schemas.microsoft.com/office/word/2015/wordml/symex" xmlns:wpg="http://schemas.microsoft.com/office/word/2010/wordprocessingGroup" xmlns:wpi="http://schemas.microsoft.com/office/word/2010/wordprocessingInk" xmlns:wne="http://schemas.microsoft.com/office/word/2006/wordml" xmlns:wps="http://schemas.microsoft.com/office/word/2010/wordprocessingShape" mc:Ignorable="w14 w15 w16se w16cid w16 w16cex w16sdtdh w16du wp14">
+<w:document xmlns:wpc="http://schemas.microsoft.com/office/word/2010/wordprocessingCanvas" xmlns:cx="http://schemas.microsoft.com/office/drawing/2014/chartex" xmlns:cx1="http://schemas.microsoft.com/office/drawing/2015/9/8/chartex" xmlns:cx2="http://schemas.microsoft.com/office/drawing/2015/10/21/chartex" xmlns:cx3="http://schemas.microsoft.com/office/drawing/2016/5/9/chartex" xmlns:cx4="http://schemas.microsoft.com/office/drawing/2016/5/10/chartex" xmlns:cx5="http://schemas.microsoft.com/office/drawing/2016/5/11/chartex" xmlns:cx6="http://schemas.microsoft.com/office/drawing/2016/5/12/chartex" xmlns:cx7="http://schemas.microsoft.com/office/drawing/2016/5/13/chartex" xmlns:cx8="http://schemas.microsoft.com/office/drawing/2016/5/14/chartex" xmlns:mc="http://schemas.openxmlformats.org/markup-compatibility/2006" xmlns:aink="http://schemas.microsoft.com/office/drawing/2016/ink" xmlns:am3d="http://schemas.microsoft.com/office/drawing/2017/model3d" xmlns:o="urn:schemas-microsoft-com:office:office" xmlns:oel="http://schemas.microsoft.com/office/2019/extlst" xmlns:r="http://schemas.openxmlformats.org/officeDocument/2006/relationships" xmlns:m="http://schemas.openxmlformats.org/officeDocument/2006/math" xmlns:v="urn:schemas-microsoft-com:vml" xmlns:wp14="http://schemas.microsoft.com/office/word/2010/wordprocessingDrawing" xmlns:wp="http://schemas.openxmlformats.org/drawingml/2006/wordprocessingDrawing" xmlns:w10="urn:schemas-microsoft-com:office:word" xmlns:w="http://schemas.openxmlformats.org/wordprocessingml/2006/main" xmlns:w14="http://schemas.microsoft.com/office/word/2010/wordml" xmlns:w15="http://schemas.microsoft.com/office/word/2012/wordml" xmlns:w16cex="http://schemas.microsoft.com/office/word/2018/wordml/cex" xmlns:w16cid="http://schemas.microsoft.com/office/word/2016/wordml/cid" xmlns:w16="http://schemas.microsoft.com/office/word/2018/wordml" xmlns:w16du="http://schemas.microsoft.com/office/word/2023/wordml/word16du" xmlns:w16sdtdh="http://schemas.microsoft.com/office/word/2020/wordml/sdtdatahash" xmlns:w16sdtfl="http://schemas.microsoft.com/office/word/2024/wordml/sdtformatlock" xmlns:w16se="http://schemas.microsoft.com/office/word/2015/wordml/symex" xmlns:wpg="http://schemas.microsoft.com/office/word/2010/wordprocessingGroup" xmlns:wpi="http://schemas.microsoft.com/office/word/2010/wordprocessingInk" xmlns:wne="http://schemas.microsoft.com/office/word/2006/wordml" xmlns:wps="http://schemas.microsoft.com/office/word/2010/wordprocessingShape" mc:Ignorable="w14 w15 w16se w16cid w16 w16cex w16sdtdh w16sdtfl w16du wp14">
   <w:body>
     <w:p/>
     <w:tbl>
@@ -227,15 +227,15 @@
               <mc:AlternateContent>
                 <mc:Choice Requires="wps">
                   <w:drawing>
-                    <wp:anchor distT="0" distB="0" distL="114300" distR="114300" simplePos="0" relativeHeight="251662336" behindDoc="0" locked="0" layoutInCell="1" allowOverlap="1" wp14:anchorId="522B1D2F" wp14:editId="171CBD78">
+                    <wp:anchor distT="0" distB="0" distL="114300" distR="114300" simplePos="0" relativeHeight="251662336" behindDoc="0" locked="0" layoutInCell="1" allowOverlap="1" wp14:anchorId="522B1D2F" wp14:editId="1EC170BA">
                       <wp:simplePos x="0" y="0"/>
                       <wp:positionH relativeFrom="margin">
-                        <wp:posOffset>325120</wp:posOffset>
+                        <wp:posOffset>92710</wp:posOffset>
                       </wp:positionH>
                       <wp:positionV relativeFrom="paragraph">
-                        <wp:posOffset>-15240</wp:posOffset>
+                        <wp:posOffset>-22860</wp:posOffset>
                       </wp:positionV>
-                      <wp:extent cx="1842135" cy="927735"/>
+                      <wp:extent cx="2336165" cy="927735"/>
                       <wp:effectExtent l="0" t="0" r="0" b="0"/>
                       <wp:wrapNone/>
                       <wp:docPr id="1154350600" name="Rectángulo: esquinas redondeadas 1154350600"/>
@@ -251,7 +251,7 @@
                             <wps:spPr bwMode="auto">
                               <a:xfrm>
                                 <a:off x="0" y="0"/>
-                                <a:ext cx="1842135" cy="927735"/>
+                                <a:ext cx="2336165" cy="927735"/>
                               </a:xfrm>
                               <a:prstGeom prst="roundRect">
                                 <a:avLst>
@@ -333,7 +333,7 @@
                 </mc:Choice>
                 <mc:Fallback>
                   <w:pict>
-                    <v:roundrect w14:anchorId="522B1D2F" id="Rectángulo: esquinas redondeadas 1154350600" o:spid="_x0000_s1026" style="position:absolute;left:0;text-align:left;margin-left:25.6pt;margin-top:-1.2pt;width:145.05pt;height:73.05pt;z-index:251662336;visibility:visible;mso-wrap-style:square;mso-width-percent:0;mso-height-percent:0;mso-wrap-distance-left:9pt;mso-wrap-distance-top:0;mso-wrap-distance-right:9pt;mso-wrap-distance-bottom:0;mso-position-horizontal:absolute;mso-position-horizontal-relative:margin;mso-position-vertical:absolute;mso-position-vertical-relative:text;mso-width-percent:0;mso-height-percent:0;mso-width-relative:margin;mso-height-relative:margin;v-text-anchor:top" arcsize="10923f" o:gfxdata="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" filled="f" stroked="f">
+                    <v:roundrect w14:anchorId="522B1D2F" id="Rectángulo: esquinas redondeadas 1154350600" o:spid="_x0000_s1026" style="position:absolute;left:0;text-align:left;margin-left:7.3pt;margin-top:-1.8pt;width:183.95pt;height:73.05pt;z-index:251662336;visibility:visible;mso-wrap-style:square;mso-width-percent:0;mso-height-percent:0;mso-wrap-distance-left:9pt;mso-wrap-distance-top:0;mso-wrap-distance-right:9pt;mso-wrap-distance-bottom:0;mso-position-horizontal:absolute;mso-position-horizontal-relative:margin;mso-position-vertical:absolute;mso-position-vertical-relative:text;mso-width-percent:0;mso-height-percent:0;mso-width-relative:margin;mso-height-relative:margin;v-text-anchor:top" arcsize="10923f" o:gfxdata="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" filled="f" stroked="f">
                       <v:stroke joinstyle="miter"/>
                       <v:textbox>
                         <w:txbxContent>
@@ -492,7 +492,6 @@
             <w:tcBorders>
               <w:bottom w:val="single" w:sz="18" w:space="0" w:color="FEDE00" w:themeColor="accent2"/>
             </w:tcBorders>
-            <w:shd w:val="clear" w:color="auto" w:fill="auto"/>
             <w:vAlign w:val="bottom"/>
           </w:tcPr>
           <w:p>
@@ -535,7 +534,6 @@
             <w:tcBorders>
               <w:top w:val="single" w:sz="18" w:space="0" w:color="FEDE00" w:themeColor="accent2"/>
             </w:tcBorders>
-            <w:shd w:val="clear" w:color="auto" w:fill="auto"/>
             <w:vAlign w:val="center"/>
           </w:tcPr>
           <w:p/>
@@ -552,7 +550,6 @@
             <w:tcBorders>
               <w:bottom w:val="single" w:sz="18" w:space="0" w:color="FEDE00" w:themeColor="accent2"/>
             </w:tcBorders>
-            <w:shd w:val="clear" w:color="auto" w:fill="auto"/>
             <w:vAlign w:val="bottom"/>
           </w:tcPr>
           <w:tbl>
@@ -1186,7 +1183,6 @@
             <w:tcBorders>
               <w:top w:val="single" w:sz="18" w:space="0" w:color="FEDE00" w:themeColor="accent2"/>
             </w:tcBorders>
-            <w:shd w:val="clear" w:color="auto" w:fill="auto"/>
             <w:vAlign w:val="center"/>
           </w:tcPr>
           <w:p/>
@@ -1209,7 +1205,6 @@
             <w:tcBorders>
               <w:bottom w:val="single" w:sz="18" w:space="0" w:color="FEDE00" w:themeColor="accent2"/>
             </w:tcBorders>
-            <w:shd w:val="clear" w:color="auto" w:fill="auto"/>
             <w:vAlign w:val="bottom"/>
           </w:tcPr>
           <w:tbl>
@@ -1800,7 +1795,6 @@
               <w:tc>
                 <w:tcPr>
                   <w:tcW w:w="1158" w:type="dxa"/>
-                  <w:shd w:val="clear" w:color="auto" w:fill="auto"/>
                 </w:tcPr>
                 <w:p>
                   <w:pPr>
@@ -2518,7 +2512,6 @@
               <w:tc>
                 <w:tcPr>
                   <w:tcW w:w="3652" w:type="dxa"/>
-                  <w:shd w:val="clear" w:color="auto" w:fill="auto"/>
                 </w:tcPr>
                 <w:p>
                   <w:pPr>
@@ -2651,7 +2644,6 @@
                     <w:bottom w:val="nil"/>
                     <w:right w:val="nil"/>
                   </w:tcBorders>
-                  <w:shd w:val="clear" w:color="auto" w:fill="auto"/>
                 </w:tcPr>
                 <w:p>
                   <w:pPr>
@@ -2804,7 +2796,6 @@
                     <w:bottom w:val="nil"/>
                     <w:right w:val="nil"/>
                   </w:tcBorders>
-                  <w:shd w:val="clear" w:color="auto" w:fill="auto"/>
                 </w:tcPr>
                 <w:p>
                   <w:pPr>
@@ -2949,7 +2940,6 @@
               <w:tc>
                 <w:tcPr>
                   <w:tcW w:w="1860" w:type="dxa"/>
-                  <w:shd w:val="clear" w:color="auto" w:fill="auto"/>
                 </w:tcPr>
                 <w:p>
                   <w:pPr>
@@ -3685,7 +3675,7 @@
 </file>
 
 <file path=word/endnotes.xml><?xml version="1.0" encoding="utf-8"?>
-<w:endnotes xmlns:wpc="http://schemas.microsoft.com/office/word/2010/wordprocessingCanvas" xmlns:cx="http://schemas.microsoft.com/office/drawing/2014/chartex" xmlns:cx1="http://schemas.microsoft.com/office/drawing/2015/9/8/chartex" xmlns:cx2="http://schemas.microsoft.com/office/drawing/2015/10/21/chartex" xmlns:cx3="http://schemas.microsoft.com/office/drawing/2016/5/9/chartex" xmlns:cx4="http://schemas.microsoft.com/office/drawing/2016/5/10/chartex" xmlns:cx5="http://schemas.microsoft.com/office/drawing/2016/5/11/chartex" xmlns:cx6="http://schemas.microsoft.com/office/drawing/2016/5/12/chartex" xmlns:cx7="http://schemas.microsoft.com/office/drawing/2016/5/13/chartex" xmlns:cx8="http://schemas.microsoft.com/office/drawing/2016/5/14/chartex" xmlns:mc="http://schemas.openxmlformats.org/markup-compatibility/2006" xmlns:aink="http://schemas.microsoft.com/office/drawing/2016/ink" xmlns:am3d="http://schemas.microsoft.com/office/drawing/2017/model3d" xmlns:o="urn:schemas-microsoft-com:office:office" xmlns:oel="http://schemas.microsoft.com/office/2019/extlst" xmlns:r="http://schemas.openxmlformats.org/officeDocument/2006/relationships" xmlns:m="http://schemas.openxmlformats.org/officeDocument/2006/math" xmlns:v="urn:schemas-microsoft-com:vml" xmlns:wp14="http://schemas.microsoft.com/office/word/2010/wordprocessingDrawing" xmlns:wp="http://schemas.openxmlformats.org/drawingml/2006/wordprocessingDrawing" xmlns:w10="urn:schemas-microsoft-com:office:word" xmlns:w="http://schemas.openxmlformats.org/wordprocessingml/2006/main" xmlns:w14="http://schemas.microsoft.com/office/word/2010/wordml" xmlns:w15="http://schemas.microsoft.com/office/word/2012/wordml" xmlns:w16cex="http://schemas.microsoft.com/office/word/2018/wordml/cex" xmlns:w16cid="http://schemas.microsoft.com/office/word/2016/wordml/cid" xmlns:w16="http://schemas.microsoft.com/office/word/2018/wordml" xmlns:w16du="http://schemas.microsoft.com/office/word/2023/wordml/word16du" xmlns:w16sdtdh="http://schemas.microsoft.com/office/word/2020/wordml/sdtdatahash" xmlns:w16se="http://schemas.microsoft.com/office/word/2015/wordml/symex" xmlns:wpg="http://schemas.microsoft.com/office/word/2010/wordprocessingGroup" xmlns:wpi="http://schemas.microsoft.com/office/word/2010/wordprocessingInk" xmlns:wne="http://schemas.microsoft.com/office/word/2006/wordml" xmlns:wps="http://schemas.microsoft.com/office/word/2010/wordprocessingShape" mc:Ignorable="w14 w15 w16se w16cid w16 w16cex w16sdtdh w16du wp14">
+<w:endnotes xmlns:wpc="http://schemas.microsoft.com/office/word/2010/wordprocessingCanvas" xmlns:cx="http://schemas.microsoft.com/office/drawing/2014/chartex" xmlns:cx1="http://schemas.microsoft.com/office/drawing/2015/9/8/chartex" xmlns:cx2="http://schemas.microsoft.com/office/drawing/2015/10/21/chartex" xmlns:cx3="http://schemas.microsoft.com/office/drawing/2016/5/9/chartex" xmlns:cx4="http://schemas.microsoft.com/office/drawing/2016/5/10/chartex" xmlns:cx5="http://schemas.microsoft.com/office/drawing/2016/5/11/chartex" xmlns:cx6="http://schemas.microsoft.com/office/drawing/2016/5/12/chartex" xmlns:cx7="http://schemas.microsoft.com/office/drawing/2016/5/13/chartex" xmlns:cx8="http://schemas.microsoft.com/office/drawing/2016/5/14/chartex" xmlns:mc="http://schemas.openxmlformats.org/markup-compatibility/2006" xmlns:aink="http://schemas.microsoft.com/office/drawing/2016/ink" xmlns:am3d="http://schemas.microsoft.com/office/drawing/2017/model3d" xmlns:o="urn:schemas-microsoft-com:office:office" xmlns:oel="http://schemas.microsoft.com/office/2019/extlst" xmlns:r="http://schemas.openxmlformats.org/officeDocument/2006/relationships" xmlns:m="http://schemas.openxmlformats.org/officeDocument/2006/math" xmlns:v="urn:schemas-microsoft-com:vml" xmlns:wp14="http://schemas.microsoft.com/office/word/2010/wordprocessingDrawing" xmlns:wp="http://schemas.openxmlformats.org/drawingml/2006/wordprocessingDrawing" xmlns:w10="urn:schemas-microsoft-com:office:word" xmlns:w="http://schemas.openxmlformats.org/wordprocessingml/2006/main" xmlns:w14="http://schemas.microsoft.com/office/word/2010/wordml" xmlns:w15="http://schemas.microsoft.com/office/word/2012/wordml" xmlns:w16cex="http://schemas.microsoft.com/office/word/2018/wordml/cex" xmlns:w16cid="http://schemas.microsoft.com/office/word/2016/wordml/cid" xmlns:w16="http://schemas.microsoft.com/office/word/2018/wordml" xmlns:w16du="http://schemas.microsoft.com/office/word/2023/wordml/word16du" xmlns:w16sdtdh="http://schemas.microsoft.com/office/word/2020/wordml/sdtdatahash" xmlns:w16sdtfl="http://schemas.microsoft.com/office/word/2024/wordml/sdtformatlock" xmlns:w16se="http://schemas.microsoft.com/office/word/2015/wordml/symex" xmlns:wpg="http://schemas.microsoft.com/office/word/2010/wordprocessingGroup" xmlns:wpi="http://schemas.microsoft.com/office/word/2010/wordprocessingInk" xmlns:wne="http://schemas.microsoft.com/office/word/2006/wordml" xmlns:wps="http://schemas.microsoft.com/office/word/2010/wordprocessingShape" mc:Ignorable="w14 w15 w16se w16cid w16 w16cex w16sdtdh w16sdtfl w16du wp14">
   <w:endnote w:type="separator" w:id="-1">
     <w:p>
       <w:pPr>
@@ -3712,7 +3702,7 @@
 </file>
 
 <file path=word/footer1.xml><?xml version="1.0" encoding="utf-8"?>
-<w:ftr xmlns:wpc="http://schemas.microsoft.com/office/word/2010/wordprocessingCanvas" xmlns:cx="http://schemas.microsoft.com/office/drawing/2014/chartex" xmlns:cx1="http://schemas.microsoft.com/office/drawing/2015/9/8/chartex" xmlns:cx2="http://schemas.microsoft.com/office/drawing/2015/10/21/chartex" xmlns:cx3="http://schemas.microsoft.com/office/drawing/2016/5/9/chartex" xmlns:cx4="http://schemas.microsoft.com/office/drawing/2016/5/10/chartex" xmlns:cx5="http://schemas.microsoft.com/office/drawing/2016/5/11/chartex" xmlns:cx6="http://schemas.microsoft.com/office/drawing/2016/5/12/chartex" xmlns:cx7="http://schemas.microsoft.com/office/drawing/2016/5/13/chartex" xmlns:cx8="http://schemas.microsoft.com/office/drawing/2016/5/14/chartex" xmlns:mc="http://schemas.openxmlformats.org/markup-compatibility/2006" xmlns:aink="http://schemas.microsoft.com/office/drawing/2016/ink" xmlns:am3d="http://schemas.microsoft.com/office/drawing/2017/model3d" xmlns:o="urn:schemas-microsoft-com:office:office" xmlns:oel="http://schemas.microsoft.com/office/2019/extlst" xmlns:r="http://schemas.openxmlformats.org/officeDocument/2006/relationships" xmlns:m="http://schemas.openxmlformats.org/officeDocument/2006/math" xmlns:v="urn:schemas-microsoft-com:vml" xmlns:wp14="http://schemas.microsoft.com/office/word/2010/wordprocessingDrawing" xmlns:wp="http://schemas.openxmlformats.org/drawingml/2006/wordprocessingDrawing" xmlns:w10="urn:schemas-microsoft-com:office:word" xmlns:w="http://schemas.openxmlformats.org/wordprocessingml/2006/main" xmlns:w14="http://schemas.microsoft.com/office/word/2010/wordml" xmlns:w15="http://schemas.microsoft.com/office/word/2012/wordml" xmlns:w16cex="http://schemas.microsoft.com/office/word/2018/wordml/cex" xmlns:w16cid="http://schemas.microsoft.com/office/word/2016/wordml/cid" xmlns:w16="http://schemas.microsoft.com/office/word/2018/wordml" xmlns:w16du="http://schemas.microsoft.com/office/word/2023/wordml/word16du" xmlns:w16sdtdh="http://schemas.microsoft.com/office/word/2020/wordml/sdtdatahash" xmlns:w16se="http://schemas.microsoft.com/office/word/2015/wordml/symex" xmlns:wpg="http://schemas.microsoft.com/office/word/2010/wordprocessingGroup" xmlns:wpi="http://schemas.microsoft.com/office/word/2010/wordprocessingInk" xmlns:wne="http://schemas.microsoft.com/office/word/2006/wordml" xmlns:wps="http://schemas.microsoft.com/office/word/2010/wordprocessingShape" mc:Ignorable="w14 w15 w16se w16cid w16 w16cex w16sdtdh w16du wp14">
+<w:ftr xmlns:wpc="http://schemas.microsoft.com/office/word/2010/wordprocessingCanvas" xmlns:cx="http://schemas.microsoft.com/office/drawing/2014/chartex" xmlns:cx1="http://schemas.microsoft.com/office/drawing/2015/9/8/chartex" xmlns:cx2="http://schemas.microsoft.com/office/drawing/2015/10/21/chartex" xmlns:cx3="http://schemas.microsoft.com/office/drawing/2016/5/9/chartex" xmlns:cx4="http://schemas.microsoft.com/office/drawing/2016/5/10/chartex" xmlns:cx5="http://schemas.microsoft.com/office/drawing/2016/5/11/chartex" xmlns:cx6="http://schemas.microsoft.com/office/drawing/2016/5/12/chartex" xmlns:cx7="http://schemas.microsoft.com/office/drawing/2016/5/13/chartex" xmlns:cx8="http://schemas.microsoft.com/office/drawing/2016/5/14/chartex" xmlns:mc="http://schemas.openxmlformats.org/markup-compatibility/2006" xmlns:aink="http://schemas.microsoft.com/office/drawing/2016/ink" xmlns:am3d="http://schemas.microsoft.com/office/drawing/2017/model3d" xmlns:o="urn:schemas-microsoft-com:office:office" xmlns:oel="http://schemas.microsoft.com/office/2019/extlst" xmlns:r="http://schemas.openxmlformats.org/officeDocument/2006/relationships" xmlns:m="http://schemas.openxmlformats.org/officeDocument/2006/math" xmlns:v="urn:schemas-microsoft-com:vml" xmlns:wp14="http://schemas.microsoft.com/office/word/2010/wordprocessingDrawing" xmlns:wp="http://schemas.openxmlformats.org/drawingml/2006/wordprocessingDrawing" xmlns:w10="urn:schemas-microsoft-com:office:word" xmlns:w="http://schemas.openxmlformats.org/wordprocessingml/2006/main" xmlns:w14="http://schemas.microsoft.com/office/word/2010/wordml" xmlns:w15="http://schemas.microsoft.com/office/word/2012/wordml" xmlns:w16cex="http://schemas.microsoft.com/office/word/2018/wordml/cex" xmlns:w16cid="http://schemas.microsoft.com/office/word/2016/wordml/cid" xmlns:w16="http://schemas.microsoft.com/office/word/2018/wordml" xmlns:w16du="http://schemas.microsoft.com/office/word/2023/wordml/word16du" xmlns:w16sdtdh="http://schemas.microsoft.com/office/word/2020/wordml/sdtdatahash" xmlns:w16sdtfl="http://schemas.microsoft.com/office/word/2024/wordml/sdtformatlock" xmlns:w16se="http://schemas.microsoft.com/office/word/2015/wordml/symex" xmlns:wpg="http://schemas.microsoft.com/office/word/2010/wordprocessingGroup" xmlns:wpi="http://schemas.microsoft.com/office/word/2010/wordprocessingInk" xmlns:wne="http://schemas.microsoft.com/office/word/2006/wordml" xmlns:wps="http://schemas.microsoft.com/office/word/2010/wordprocessingShape" mc:Ignorable="w14 w15 w16se w16cid w16 w16cex w16sdtdh w16sdtfl w16du wp14">
   <w:p>
     <w:pPr>
       <w:pStyle w:val="Piedepgina"/>
@@ -3777,7 +3767,7 @@
 </file>
 
 <file path=word/footer2.xml><?xml version="1.0" encoding="utf-8"?>
-<w:ftr xmlns:wpc="http://schemas.microsoft.com/office/word/2010/wordprocessingCanvas" xmlns:cx="http://schemas.microsoft.com/office/drawing/2014/chartex" xmlns:cx1="http://schemas.microsoft.com/office/drawing/2015/9/8/chartex" xmlns:cx2="http://schemas.microsoft.com/office/drawing/2015/10/21/chartex" xmlns:cx3="http://schemas.microsoft.com/office/drawing/2016/5/9/chartex" xmlns:cx4="http://schemas.microsoft.com/office/drawing/2016/5/10/chartex" xmlns:cx5="http://schemas.microsoft.com/office/drawing/2016/5/11/chartex" xmlns:cx6="http://schemas.microsoft.com/office/drawing/2016/5/12/chartex" xmlns:cx7="http://schemas.microsoft.com/office/drawing/2016/5/13/chartex" xmlns:cx8="http://schemas.microsoft.com/office/drawing/2016/5/14/chartex" xmlns:mc="http://schemas.openxmlformats.org/markup-compatibility/2006" xmlns:aink="http://schemas.microsoft.com/office/drawing/2016/ink" xmlns:am3d="http://schemas.microsoft.com/office/drawing/2017/model3d" xmlns:o="urn:schemas-microsoft-com:office:office" xmlns:oel="http://schemas.microsoft.com/office/2019/extlst" xmlns:r="http://schemas.openxmlformats.org/officeDocument/2006/relationships" xmlns:m="http://schemas.openxmlformats.org/officeDocument/2006/math" xmlns:v="urn:schemas-microsoft-com:vml" xmlns:wp14="http://schemas.microsoft.com/office/word/2010/wordprocessingDrawing" xmlns:wp="http://schemas.openxmlformats.org/drawingml/2006/wordprocessingDrawing" xmlns:w10="urn:schemas-microsoft-com:office:word" xmlns:w="http://schemas.openxmlformats.org/wordprocessingml/2006/main" xmlns:w14="http://schemas.microsoft.com/office/word/2010/wordml" xmlns:w15="http://schemas.microsoft.com/office/word/2012/wordml" xmlns:w16cex="http://schemas.microsoft.com/office/word/2018/wordml/cex" xmlns:w16cid="http://schemas.microsoft.com/office/word/2016/wordml/cid" xmlns:w16="http://schemas.microsoft.com/office/word/2018/wordml" xmlns:w16du="http://schemas.microsoft.com/office/word/2023/wordml/word16du" xmlns:w16sdtdh="http://schemas.microsoft.com/office/word/2020/wordml/sdtdatahash" xmlns:w16se="http://schemas.microsoft.com/office/word/2015/wordml/symex" xmlns:wpg="http://schemas.microsoft.com/office/word/2010/wordprocessingGroup" xmlns:wpi="http://schemas.microsoft.com/office/word/2010/wordprocessingInk" xmlns:wne="http://schemas.microsoft.com/office/word/2006/wordml" xmlns:wps="http://schemas.microsoft.com/office/word/2010/wordprocessingShape" mc:Ignorable="w14 w15 w16se w16cid w16 w16cex w16sdtdh w16du wp14">
+<w:ftr xmlns:wpc="http://schemas.microsoft.com/office/word/2010/wordprocessingCanvas" xmlns:cx="http://schemas.microsoft.com/office/drawing/2014/chartex" xmlns:cx1="http://schemas.microsoft.com/office/drawing/2015/9/8/chartex" xmlns:cx2="http://schemas.microsoft.com/office/drawing/2015/10/21/chartex" xmlns:cx3="http://schemas.microsoft.com/office/drawing/2016/5/9/chartex" xmlns:cx4="http://schemas.microsoft.com/office/drawing/2016/5/10/chartex" xmlns:cx5="http://schemas.microsoft.com/office/drawing/2016/5/11/chartex" xmlns:cx6="http://schemas.microsoft.com/office/drawing/2016/5/12/chartex" xmlns:cx7="http://schemas.microsoft.com/office/drawing/2016/5/13/chartex" xmlns:cx8="http://schemas.microsoft.com/office/drawing/2016/5/14/chartex" xmlns:mc="http://schemas.openxmlformats.org/markup-compatibility/2006" xmlns:aink="http://schemas.microsoft.com/office/drawing/2016/ink" xmlns:am3d="http://schemas.microsoft.com/office/drawing/2017/model3d" xmlns:o="urn:schemas-microsoft-com:office:office" xmlns:oel="http://schemas.microsoft.com/office/2019/extlst" xmlns:r="http://schemas.openxmlformats.org/officeDocument/2006/relationships" xmlns:m="http://schemas.openxmlformats.org/officeDocument/2006/math" xmlns:v="urn:schemas-microsoft-com:vml" xmlns:wp14="http://schemas.microsoft.com/office/word/2010/wordprocessingDrawing" xmlns:wp="http://schemas.openxmlformats.org/drawingml/2006/wordprocessingDrawing" xmlns:w10="urn:schemas-microsoft-com:office:word" xmlns:w="http://schemas.openxmlformats.org/wordprocessingml/2006/main" xmlns:w14="http://schemas.microsoft.com/office/word/2010/wordml" xmlns:w15="http://schemas.microsoft.com/office/word/2012/wordml" xmlns:w16cex="http://schemas.microsoft.com/office/word/2018/wordml/cex" xmlns:w16cid="http://schemas.microsoft.com/office/word/2016/wordml/cid" xmlns:w16="http://schemas.microsoft.com/office/word/2018/wordml" xmlns:w16du="http://schemas.microsoft.com/office/word/2023/wordml/word16du" xmlns:w16sdtdh="http://schemas.microsoft.com/office/word/2020/wordml/sdtdatahash" xmlns:w16sdtfl="http://schemas.microsoft.com/office/word/2024/wordml/sdtformatlock" xmlns:w16se="http://schemas.microsoft.com/office/word/2015/wordml/symex" xmlns:wpg="http://schemas.microsoft.com/office/word/2010/wordprocessingGroup" xmlns:wpi="http://schemas.microsoft.com/office/word/2010/wordprocessingInk" xmlns:wne="http://schemas.microsoft.com/office/word/2006/wordml" xmlns:wps="http://schemas.microsoft.com/office/word/2010/wordprocessingShape" mc:Ignorable="w14 w15 w16se w16cid w16 w16cex w16sdtdh w16sdtfl w16du wp14">
   <w:p>
     <w:pPr>
       <w:pStyle w:val="Piedepgina"/>
@@ -3861,7 +3851,7 @@
 </file>
 
 <file path=word/footnotes.xml><?xml version="1.0" encoding="utf-8"?>
-<w:footnotes xmlns:wpc="http://schemas.microsoft.com/office/word/2010/wordprocessingCanvas" xmlns:cx="http://schemas.microsoft.com/office/drawing/2014/chartex" xmlns:cx1="http://schemas.microsoft.com/office/drawing/2015/9/8/chartex" xmlns:cx2="http://schemas.microsoft.com/office/drawing/2015/10/21/chartex" xmlns:cx3="http://schemas.microsoft.com/office/drawing/2016/5/9/chartex" xmlns:cx4="http://schemas.microsoft.com/office/drawing/2016/5/10/chartex" xmlns:cx5="http://schemas.microsoft.com/office/drawing/2016/5/11/chartex" xmlns:cx6="http://schemas.microsoft.com/office/drawing/2016/5/12/chartex" xmlns:cx7="http://schemas.microsoft.com/office/drawing/2016/5/13/chartex" xmlns:cx8="http://schemas.microsoft.com/office/drawing/2016/5/14/chartex" xmlns:mc="http://schemas.openxmlformats.org/markup-compatibility/2006" xmlns:aink="http://schemas.microsoft.com/office/drawing/2016/ink" xmlns:am3d="http://schemas.microsoft.com/office/drawing/2017/model3d" xmlns:o="urn:schemas-microsoft-com:office:office" xmlns:oel="http://schemas.microsoft.com/office/2019/extlst" xmlns:r="http://schemas.openxmlformats.org/officeDocument/2006/relationships" xmlns:m="http://schemas.openxmlformats.org/officeDocument/2006/math" xmlns:v="urn:schemas-microsoft-com:vml" xmlns:wp14="http://schemas.microsoft.com/office/word/2010/wordprocessingDrawing" xmlns:wp="http://schemas.openxmlformats.org/drawingml/2006/wordprocessingDrawing" xmlns:w10="urn:schemas-microsoft-com:office:word" xmlns:w="http://schemas.openxmlformats.org/wordprocessingml/2006/main" xmlns:w14="http://schemas.microsoft.com/office/word/2010/wordml" xmlns:w15="http://schemas.microsoft.com/office/word/2012/wordml" xmlns:w16cex="http://schemas.microsoft.com/office/word/2018/wordml/cex" xmlns:w16cid="http://schemas.microsoft.com/office/word/2016/wordml/cid" xmlns:w16="http://schemas.microsoft.com/office/word/2018/wordml" xmlns:w16du="http://schemas.microsoft.com/office/word/2023/wordml/word16du" xmlns:w16sdtdh="http://schemas.microsoft.com/office/word/2020/wordml/sdtdatahash" xmlns:w16se="http://schemas.microsoft.com/office/word/2015/wordml/symex" xmlns:wpg="http://schemas.microsoft.com/office/word/2010/wordprocessingGroup" xmlns:wpi="http://schemas.microsoft.com/office/word/2010/wordprocessingInk" xmlns:wne="http://schemas.microsoft.com/office/word/2006/wordml" xmlns:wps="http://schemas.microsoft.com/office/word/2010/wordprocessingShape" mc:Ignorable="w14 w15 w16se w16cid w16 w16cex w16sdtdh w16du wp14">
+<w:footnotes xmlns:wpc="http://schemas.microsoft.com/office/word/2010/wordprocessingCanvas" xmlns:cx="http://schemas.microsoft.com/office/drawing/2014/chartex" xmlns:cx1="http://schemas.microsoft.com/office/drawing/2015/9/8/chartex" xmlns:cx2="http://schemas.microsoft.com/office/drawing/2015/10/21/chartex" xmlns:cx3="http://schemas.microsoft.com/office/drawing/2016/5/9/chartex" xmlns:cx4="http://schemas.microsoft.com/office/drawing/2016/5/10/chartex" xmlns:cx5="http://schemas.microsoft.com/office/drawing/2016/5/11/chartex" xmlns:cx6="http://schemas.microsoft.com/office/drawing/2016/5/12/chartex" xmlns:cx7="http://schemas.microsoft.com/office/drawing/2016/5/13/chartex" xmlns:cx8="http://schemas.microsoft.com/office/drawing/2016/5/14/chartex" xmlns:mc="http://schemas.openxmlformats.org/markup-compatibility/2006" xmlns:aink="http://schemas.microsoft.com/office/drawing/2016/ink" xmlns:am3d="http://schemas.microsoft.com/office/drawing/2017/model3d" xmlns:o="urn:schemas-microsoft-com:office:office" xmlns:oel="http://schemas.microsoft.com/office/2019/extlst" xmlns:r="http://schemas.openxmlformats.org/officeDocument/2006/relationships" xmlns:m="http://schemas.openxmlformats.org/officeDocument/2006/math" xmlns:v="urn:schemas-microsoft-com:vml" xmlns:wp14="http://schemas.microsoft.com/office/word/2010/wordprocessingDrawing" xmlns:wp="http://schemas.openxmlformats.org/drawingml/2006/wordprocessingDrawing" xmlns:w10="urn:schemas-microsoft-com:office:word" xmlns:w="http://schemas.openxmlformats.org/wordprocessingml/2006/main" xmlns:w14="http://schemas.microsoft.com/office/word/2010/wordml" xmlns:w15="http://schemas.microsoft.com/office/word/2012/wordml" xmlns:w16cex="http://schemas.microsoft.com/office/word/2018/wordml/cex" xmlns:w16cid="http://schemas.microsoft.com/office/word/2016/wordml/cid" xmlns:w16="http://schemas.microsoft.com/office/word/2018/wordml" xmlns:w16du="http://schemas.microsoft.com/office/word/2023/wordml/word16du" xmlns:w16sdtdh="http://schemas.microsoft.com/office/word/2020/wordml/sdtdatahash" xmlns:w16sdtfl="http://schemas.microsoft.com/office/word/2024/wordml/sdtformatlock" xmlns:w16se="http://schemas.microsoft.com/office/word/2015/wordml/symex" xmlns:wpg="http://schemas.microsoft.com/office/word/2010/wordprocessingGroup" xmlns:wpi="http://schemas.microsoft.com/office/word/2010/wordprocessingInk" xmlns:wne="http://schemas.microsoft.com/office/word/2006/wordml" xmlns:wps="http://schemas.microsoft.com/office/word/2010/wordprocessingShape" mc:Ignorable="w14 w15 w16se w16cid w16 w16cex w16sdtdh w16sdtfl w16du wp14">
   <w:footnote w:type="separator" w:id="-1">
     <w:p>
       <w:pPr>
@@ -3888,7 +3878,7 @@
 </file>
 
 <file path=word/numbering.xml><?xml version="1.0" encoding="utf-8"?>
-<w:numbering xmlns:wpc="http://schemas.microsoft.com/office/word/2010/wordprocessingCanvas" xmlns:cx="http://schemas.microsoft.com/office/drawing/2014/chartex" xmlns:cx1="http://schemas.microsoft.com/office/drawing/2015/9/8/chartex" xmlns:cx2="http://schemas.microsoft.com/office/drawing/2015/10/21/chartex" xmlns:cx3="http://schemas.microsoft.com/office/drawing/2016/5/9/chartex" xmlns:cx4="http://schemas.microsoft.com/office/drawing/2016/5/10/chartex" xmlns:cx5="http://schemas.microsoft.com/office/drawing/2016/5/11/chartex" xmlns:cx6="http://schemas.microsoft.com/office/drawing/2016/5/12/chartex" xmlns:cx7="http://schemas.microsoft.com/office/drawing/2016/5/13/chartex" xmlns:cx8="http://schemas.microsoft.com/office/drawing/2016/5/14/chartex" xmlns:mc="http://schemas.openxmlformats.org/markup-compatibility/2006" xmlns:aink="http://schemas.microsoft.com/office/drawing/2016/ink" xmlns:am3d="http://schemas.microsoft.com/office/drawing/2017/model3d" xmlns:o="urn:schemas-microsoft-com:office:office" xmlns:oel="http://schemas.microsoft.com/office/2019/extlst" xmlns:r="http://schemas.openxmlformats.org/officeDocument/2006/relationships" xmlns:m="http://schemas.openxmlformats.org/officeDocument/2006/math" xmlns:v="urn:schemas-microsoft-com:vml" xmlns:wp14="http://schemas.microsoft.com/office/word/2010/wordprocessingDrawing" xmlns:wp="http://schemas.openxmlformats.org/drawingml/2006/wordprocessingDrawing" xmlns:w10="urn:schemas-microsoft-com:office:word" xmlns:w="http://schemas.openxmlformats.org/wordprocessingml/2006/main" xmlns:w14="http://schemas.microsoft.com/office/word/2010/wordml" xmlns:w15="http://schemas.microsoft.com/office/word/2012/wordml" xmlns:w16cex="http://schemas.microsoft.com/office/word/2018/wordml/cex" xmlns:w16cid="http://schemas.microsoft.com/office/word/2016/wordml/cid" xmlns:w16="http://schemas.microsoft.com/office/word/2018/wordml" xmlns:w16du="http://schemas.microsoft.com/office/word/2023/wordml/word16du" xmlns:w16sdtdh="http://schemas.microsoft.com/office/word/2020/wordml/sdtdatahash" xmlns:w16se="http://schemas.microsoft.com/office/word/2015/wordml/symex" xmlns:wpg="http://schemas.microsoft.com/office/word/2010/wordprocessingGroup" xmlns:wpi="http://schemas.microsoft.com/office/word/2010/wordprocessingInk" xmlns:wne="http://schemas.microsoft.com/office/word/2006/wordml" xmlns:wps="http://schemas.microsoft.com/office/word/2010/wordprocessingShape" mc:Ignorable="w14 w15 w16se w16cid w16 w16cex w16sdtdh w16du wp14">
+<w:numbering xmlns:wpc="http://schemas.microsoft.com/office/word/2010/wordprocessingCanvas" xmlns:cx="http://schemas.microsoft.com/office/drawing/2014/chartex" xmlns:cx1="http://schemas.microsoft.com/office/drawing/2015/9/8/chartex" xmlns:cx2="http://schemas.microsoft.com/office/drawing/2015/10/21/chartex" xmlns:cx3="http://schemas.microsoft.com/office/drawing/2016/5/9/chartex" xmlns:cx4="http://schemas.microsoft.com/office/drawing/2016/5/10/chartex" xmlns:cx5="http://schemas.microsoft.com/office/drawing/2016/5/11/chartex" xmlns:cx6="http://schemas.microsoft.com/office/drawing/2016/5/12/chartex" xmlns:cx7="http://schemas.microsoft.com/office/drawing/2016/5/13/chartex" xmlns:cx8="http://schemas.microsoft.com/office/drawing/2016/5/14/chartex" xmlns:mc="http://schemas.openxmlformats.org/markup-compatibility/2006" xmlns:aink="http://schemas.microsoft.com/office/drawing/2016/ink" xmlns:am3d="http://schemas.microsoft.com/office/drawing/2017/model3d" xmlns:o="urn:schemas-microsoft-com:office:office" xmlns:oel="http://schemas.microsoft.com/office/2019/extlst" xmlns:r="http://schemas.openxmlformats.org/officeDocument/2006/relationships" xmlns:m="http://schemas.openxmlformats.org/officeDocument/2006/math" xmlns:v="urn:schemas-microsoft-com:vml" xmlns:wp14="http://schemas.microsoft.com/office/word/2010/wordprocessingDrawing" xmlns:wp="http://schemas.openxmlformats.org/drawingml/2006/wordprocessingDrawing" xmlns:w10="urn:schemas-microsoft-com:office:word" xmlns:w="http://schemas.openxmlformats.org/wordprocessingml/2006/main" xmlns:w14="http://schemas.microsoft.com/office/word/2010/wordml" xmlns:w15="http://schemas.microsoft.com/office/word/2012/wordml" xmlns:w16cex="http://schemas.microsoft.com/office/word/2018/wordml/cex" xmlns:w16cid="http://schemas.microsoft.com/office/word/2016/wordml/cid" xmlns:w16="http://schemas.microsoft.com/office/word/2018/wordml" xmlns:w16du="http://schemas.microsoft.com/office/word/2023/wordml/word16du" xmlns:w16sdtdh="http://schemas.microsoft.com/office/word/2020/wordml/sdtdatahash" xmlns:w16sdtfl="http://schemas.microsoft.com/office/word/2024/wordml/sdtformatlock" xmlns:w16se="http://schemas.microsoft.com/office/word/2015/wordml/symex" xmlns:wpg="http://schemas.microsoft.com/office/word/2010/wordprocessingGroup" xmlns:wpi="http://schemas.microsoft.com/office/word/2010/wordprocessingInk" xmlns:wne="http://schemas.microsoft.com/office/word/2006/wordml" xmlns:wps="http://schemas.microsoft.com/office/word/2010/wordprocessingShape" mc:Ignorable="w14 w15 w16se w16cid w16 w16cex w16sdtdh w16sdtfl w16du wp14">
   <w:abstractNum w:abstractNumId="0" w15:restartNumberingAfterBreak="0">
     <w:nsid w:val="FFFFFF7C"/>
     <w:multiLevelType w:val="singleLevel"/>
@@ -3993,7 +3983,7 @@
 </file>
 
 <file path=word/styles.xml><?xml version="1.0" encoding="utf-8"?>
-<w:styles xmlns:mc="http://schemas.openxmlformats.org/markup-compatibility/2006" xmlns:r="http://schemas.openxmlformats.org/officeDocument/2006/relationships" xmlns:w="http://schemas.openxmlformats.org/wordprocessingml/2006/main" xmlns:w14="http://schemas.microsoft.com/office/word/2010/wordml" xmlns:w15="http://schemas.microsoft.com/office/word/2012/wordml" xmlns:w16cex="http://schemas.microsoft.com/office/word/2018/wordml/cex" xmlns:w16cid="http://schemas.microsoft.com/office/word/2016/wordml/cid" xmlns:w16="http://schemas.microsoft.com/office/word/2018/wordml" xmlns:w16du="http://schemas.microsoft.com/office/word/2023/wordml/word16du" xmlns:w16sdtdh="http://schemas.microsoft.com/office/word/2020/wordml/sdtdatahash" xmlns:w16se="http://schemas.microsoft.com/office/word/2015/wordml/symex" mc:Ignorable="w14 w15 w16se w16cid w16 w16cex w16sdtdh w16du">
+<w:styles xmlns:mc="http://schemas.openxmlformats.org/markup-compatibility/2006" xmlns:r="http://schemas.openxmlformats.org/officeDocument/2006/relationships" xmlns:w="http://schemas.openxmlformats.org/wordprocessingml/2006/main" xmlns:w14="http://schemas.microsoft.com/office/word/2010/wordml" xmlns:w15="http://schemas.microsoft.com/office/word/2012/wordml" xmlns:w16cex="http://schemas.microsoft.com/office/word/2018/wordml/cex" xmlns:w16cid="http://schemas.microsoft.com/office/word/2016/wordml/cid" xmlns:w16="http://schemas.microsoft.com/office/word/2018/wordml" xmlns:w16du="http://schemas.microsoft.com/office/word/2023/wordml/word16du" xmlns:w16sdtdh="http://schemas.microsoft.com/office/word/2020/wordml/sdtdatahash" xmlns:w16sdtfl="http://schemas.microsoft.com/office/word/2024/wordml/sdtformatlock" xmlns:w16se="http://schemas.microsoft.com/office/word/2015/wordml/symex" mc:Ignorable="w14 w15 w16se w16cid w16 w16cex w16sdtdh w16sdtfl w16du">
   <w:docDefaults>
     <w:rPrDefault>
       <w:rPr>
@@ -4852,7 +4842,7 @@
       <w:szCs w:val="18"/>
     </w:rPr>
   </w:style>
-  <w:style w:type="character" w:styleId="Textoennegrita">
+  <w:style w:type="character" w:styleId="Fuerte">
     <w:name w:val="Strong"/>
     <w:basedOn w:val="Fuentedeprrafopredeter"/>
     <w:uiPriority w:val="4"/>
@@ -5544,7 +5534,7 @@
 </file>
 
 <file path=word/glossary/document.xml><?xml version="1.0" encoding="utf-8"?>
-<w:glossaryDocument xmlns:wpc="http://schemas.microsoft.com/office/word/2010/wordprocessingCanvas" xmlns:cx="http://schemas.microsoft.com/office/drawing/2014/chartex" xmlns:cx1="http://schemas.microsoft.com/office/drawing/2015/9/8/chartex" xmlns:cx2="http://schemas.microsoft.com/office/drawing/2015/10/21/chartex" xmlns:cx3="http://schemas.microsoft.com/office/drawing/2016/5/9/chartex" xmlns:cx4="http://schemas.microsoft.com/office/drawing/2016/5/10/chartex" xmlns:cx5="http://schemas.microsoft.com/office/drawing/2016/5/11/chartex" xmlns:cx6="http://schemas.microsoft.com/office/drawing/2016/5/12/chartex" xmlns:cx7="http://schemas.microsoft.com/office/drawing/2016/5/13/chartex" xmlns:cx8="http://schemas.microsoft.com/office/drawing/2016/5/14/chartex" xmlns:mc="http://schemas.openxmlformats.org/markup-compatibility/2006" xmlns:aink="http://schemas.microsoft.com/office/drawing/2016/ink" xmlns:am3d="http://schemas.microsoft.com/office/drawing/2017/model3d" xmlns:o="urn:schemas-microsoft-com:office:office" xmlns:oel="http://schemas.microsoft.com/office/2019/extlst" xmlns:r="http://schemas.openxmlformats.org/officeDocument/2006/relationships" xmlns:m="http://schemas.openxmlformats.org/officeDocument/2006/math" xmlns:v="urn:schemas-microsoft-com:vml" xmlns:wp14="http://schemas.microsoft.com/office/word/2010/wordprocessingDrawing" xmlns:wp="http://schemas.openxmlformats.org/drawingml/2006/wordprocessingDrawing" xmlns:w10="urn:schemas-microsoft-com:office:word" xmlns:w="http://schemas.openxmlformats.org/wordprocessingml/2006/main" xmlns:w14="http://schemas.microsoft.com/office/word/2010/wordml" xmlns:w15="http://schemas.microsoft.com/office/word/2012/wordml" xmlns:w16cex="http://schemas.microsoft.com/office/word/2018/wordml/cex" xmlns:w16cid="http://schemas.microsoft.com/office/word/2016/wordml/cid" xmlns:w16="http://schemas.microsoft.com/office/word/2018/wordml" xmlns:w16du="http://schemas.microsoft.com/office/word/2023/wordml/word16du" xmlns:w16sdtdh="http://schemas.microsoft.com/office/word/2020/wordml/sdtdatahash" xmlns:w16se="http://schemas.microsoft.com/office/word/2015/wordml/symex" xmlns:wpg="http://schemas.microsoft.com/office/word/2010/wordprocessingGroup" xmlns:wpi="http://schemas.microsoft.com/office/word/2010/wordprocessingInk" xmlns:wne="http://schemas.microsoft.com/office/word/2006/wordml" xmlns:wps="http://schemas.microsoft.com/office/word/2010/wordprocessingShape" mc:Ignorable="w14 w15 w16se w16cid w16 w16cex w16sdtdh w16du wp14">
+<w:glossaryDocument xmlns:wpc="http://schemas.microsoft.com/office/word/2010/wordprocessingCanvas" xmlns:cx="http://schemas.microsoft.com/office/drawing/2014/chartex" xmlns:cx1="http://schemas.microsoft.com/office/drawing/2015/9/8/chartex" xmlns:cx2="http://schemas.microsoft.com/office/drawing/2015/10/21/chartex" xmlns:cx3="http://schemas.microsoft.com/office/drawing/2016/5/9/chartex" xmlns:cx4="http://schemas.microsoft.com/office/drawing/2016/5/10/chartex" xmlns:cx5="http://schemas.microsoft.com/office/drawing/2016/5/11/chartex" xmlns:cx6="http://schemas.microsoft.com/office/drawing/2016/5/12/chartex" xmlns:cx7="http://schemas.microsoft.com/office/drawing/2016/5/13/chartex" xmlns:cx8="http://schemas.microsoft.com/office/drawing/2016/5/14/chartex" xmlns:mc="http://schemas.openxmlformats.org/markup-compatibility/2006" xmlns:aink="http://schemas.microsoft.com/office/drawing/2016/ink" xmlns:am3d="http://schemas.microsoft.com/office/drawing/2017/model3d" xmlns:o="urn:schemas-microsoft-com:office:office" xmlns:oel="http://schemas.microsoft.com/office/2019/extlst" xmlns:r="http://schemas.openxmlformats.org/officeDocument/2006/relationships" xmlns:m="http://schemas.openxmlformats.org/officeDocument/2006/math" xmlns:v="urn:schemas-microsoft-com:vml" xmlns:wp14="http://schemas.microsoft.com/office/word/2010/wordprocessingDrawing" xmlns:wp="http://schemas.openxmlformats.org/drawingml/2006/wordprocessingDrawing" xmlns:w10="urn:schemas-microsoft-com:office:word" xmlns:w="http://schemas.openxmlformats.org/wordprocessingml/2006/main" xmlns:w14="http://schemas.microsoft.com/office/word/2010/wordml" xmlns:w15="http://schemas.microsoft.com/office/word/2012/wordml" xmlns:w16cex="http://schemas.microsoft.com/office/word/2018/wordml/cex" xmlns:w16cid="http://schemas.microsoft.com/office/word/2016/wordml/cid" xmlns:w16="http://schemas.microsoft.com/office/word/2018/wordml" xmlns:w16du="http://schemas.microsoft.com/office/word/2023/wordml/word16du" xmlns:w16sdtdh="http://schemas.microsoft.com/office/word/2020/wordml/sdtdatahash" xmlns:w16sdtfl="http://schemas.microsoft.com/office/word/2024/wordml/sdtformatlock" xmlns:w16se="http://schemas.microsoft.com/office/word/2015/wordml/symex" xmlns:wpg="http://schemas.microsoft.com/office/word/2010/wordprocessingGroup" xmlns:wpi="http://schemas.microsoft.com/office/word/2010/wordprocessingInk" xmlns:wne="http://schemas.microsoft.com/office/word/2006/wordml" xmlns:wps="http://schemas.microsoft.com/office/word/2010/wordprocessingShape" mc:Ignorable="w14 w15 w16se w16cid w16 w16cex w16sdtdh w16sdtfl w16du wp14">
   <w:docParts>
     <w:docPart>
       <w:docPartPr>
@@ -5609,16 +5599,14 @@
 </file>
 
 <file path=word/glossary/fontTable.xml><?xml version="1.0" encoding="utf-8"?>
-<w:fonts xmlns:mc="http://schemas.openxmlformats.org/markup-compatibility/2006" xmlns:r="http://schemas.openxmlformats.org/officeDocument/2006/relationships" xmlns:w="http://schemas.openxmlformats.org/wordprocessingml/2006/main" xmlns:w14="http://schemas.microsoft.com/office/word/2010/wordml" xmlns:w15="http://schemas.microsoft.com/office/word/2012/wordml" xmlns:w16cex="http://schemas.microsoft.com/office/word/2018/wordml/cex" xmlns:w16cid="http://schemas.microsoft.com/office/word/2016/wordml/cid" xmlns:w16="http://schemas.microsoft.com/office/word/2018/wordml" xmlns:w16du="http://schemas.microsoft.com/office/word/2023/wordml/word16du" xmlns:w16sdtdh="http://schemas.microsoft.com/office/word/2020/wordml/sdtdatahash" xmlns:w16se="http://schemas.microsoft.com/office/word/2015/wordml/symex" mc:Ignorable="w14 w15 w16se w16cid w16 w16cex w16sdtdh w16du">
+<w:fonts xmlns:mc="http://schemas.openxmlformats.org/markup-compatibility/2006" xmlns:r="http://schemas.openxmlformats.org/officeDocument/2006/relationships" xmlns:w="http://schemas.openxmlformats.org/wordprocessingml/2006/main" xmlns:w14="http://schemas.microsoft.com/office/word/2010/wordml" xmlns:w15="http://schemas.microsoft.com/office/word/2012/wordml" xmlns:w16cex="http://schemas.microsoft.com/office/word/2018/wordml/cex" xmlns:w16cid="http://schemas.microsoft.com/office/word/2016/wordml/cid" xmlns:w16="http://schemas.microsoft.com/office/word/2018/wordml" xmlns:w16du="http://schemas.microsoft.com/office/word/2023/wordml/word16du" xmlns:w16sdtdh="http://schemas.microsoft.com/office/word/2020/wordml/sdtdatahash" xmlns:w16sdtfl="http://schemas.microsoft.com/office/word/2024/wordml/sdtformatlock" xmlns:w16se="http://schemas.microsoft.com/office/word/2015/wordml/symex" mc:Ignorable="w14 w15 w16se w16cid w16 w16cex w16sdtdh w16sdtfl w16du">
   <w:font w:name="Franklin Gothic Book">
-    <w:panose1 w:val="020B0503020102020204"/>
     <w:charset w:val="00"/>
     <w:family w:val="swiss"/>
     <w:pitch w:val="variable"/>
     <w:sig w:usb0="00000287" w:usb1="00000000" w:usb2="00000000" w:usb3="00000000" w:csb0="0000009F" w:csb1="00000000"/>
   </w:font>
   <w:font w:name="MS Mincho">
-    <w:altName w:val="ＭＳ 明朝"/>
     <w:panose1 w:val="02020609040205080304"/>
     <w:charset w:val="80"/>
     <w:family w:val="modern"/>
@@ -5647,7 +5635,6 @@
     <w:sig w:usb0="00000001" w:usb1="080E0000" w:usb2="00000010" w:usb3="00000000" w:csb0="00040000" w:csb1="00000000"/>
   </w:font>
   <w:font w:name="STKaiti">
-    <w:altName w:val="华文楷体"/>
     <w:charset w:val="86"/>
     <w:family w:val="auto"/>
     <w:pitch w:val="variable"/>
@@ -5674,30 +5661,26 @@
     <w:pitch w:val="variable"/>
     <w:sig w:usb0="00000003" w:usb1="00000000" w:usb2="00000000" w:usb3="00000000" w:csb0="00000001" w:csb1="00000000"/>
   </w:font>
-  <w:font w:name="Calibri">
-    <w:panose1 w:val="020F0502020204030204"/>
+  <w:font w:name="Aptos">
     <w:charset w:val="00"/>
     <w:family w:val="swiss"/>
     <w:pitch w:val="variable"/>
-    <w:sig w:usb0="E4002EFF" w:usb1="C200247B" w:usb2="00000009" w:usb3="00000000" w:csb0="000001FF" w:csb1="00000000"/>
+    <w:sig w:usb0="20000287" w:usb1="00000003" w:usb2="00000000" w:usb3="00000000" w:csb0="0000019F" w:csb1="00000000"/>
   </w:font>
   <w:font w:name="DengXian">
-    <w:altName w:val="等线"/>
     <w:panose1 w:val="02010600030101010101"/>
     <w:charset w:val="86"/>
     <w:family w:val="auto"/>
     <w:pitch w:val="variable"/>
     <w:sig w:usb0="A00002BF" w:usb1="38CF7CFA" w:usb2="00000016" w:usb3="00000000" w:csb0="0004000F" w:csb1="00000000"/>
   </w:font>
-  <w:font w:name="Calibri Light">
-    <w:panose1 w:val="020F0302020204030204"/>
+  <w:font w:name="Aptos Display">
     <w:charset w:val="00"/>
     <w:family w:val="swiss"/>
     <w:pitch w:val="variable"/>
-    <w:sig w:usb0="E4002EFF" w:usb1="C200247B" w:usb2="00000009" w:usb3="00000000" w:csb0="000001FF" w:csb1="00000000"/>
+    <w:sig w:usb0="20000287" w:usb1="00000003" w:usb2="00000000" w:usb3="00000000" w:csb0="0000019F" w:csb1="00000000"/>
   </w:font>
   <w:font w:name="DengXian Light">
-    <w:altName w:val="等线 Light"/>
     <w:charset w:val="86"/>
     <w:family w:val="auto"/>
     <w:pitch w:val="variable"/>
@@ -5707,7 +5690,7 @@
 </file>
 
 <file path=word/glossary/settings.xml><?xml version="1.0" encoding="utf-8"?>
-<w:settings xmlns:mc="http://schemas.openxmlformats.org/markup-compatibility/2006" xmlns:o="urn:schemas-microsoft-com:office:office" xmlns:r="http://schemas.openxmlformats.org/officeDocument/2006/relationships" xmlns:m="http://schemas.openxmlformats.org/officeDocument/2006/math" xmlns:v="urn:schemas-microsoft-com:vml" xmlns:w10="urn:schemas-microsoft-com:office:word" xmlns:w="http://schemas.openxmlformats.org/wordprocessingml/2006/main" xmlns:w14="http://schemas.microsoft.com/office/word/2010/wordml" xmlns:w15="http://schemas.microsoft.com/office/word/2012/wordml" xmlns:w16cex="http://schemas.microsoft.com/office/word/2018/wordml/cex" xmlns:w16cid="http://schemas.microsoft.com/office/word/2016/wordml/cid" xmlns:w16="http://schemas.microsoft.com/office/word/2018/wordml" xmlns:w16du="http://schemas.microsoft.com/office/word/2023/wordml/word16du" xmlns:w16sdtdh="http://schemas.microsoft.com/office/word/2020/wordml/sdtdatahash" xmlns:w16se="http://schemas.microsoft.com/office/word/2015/wordml/symex" xmlns:sl="http://schemas.openxmlformats.org/schemaLibrary/2006/main" mc:Ignorable="w14 w15 w16se w16cid w16 w16cex w16sdtdh w16du">
+<w:settings xmlns:mc="http://schemas.openxmlformats.org/markup-compatibility/2006" xmlns:o="urn:schemas-microsoft-com:office:office" xmlns:r="http://schemas.openxmlformats.org/officeDocument/2006/relationships" xmlns:m="http://schemas.openxmlformats.org/officeDocument/2006/math" xmlns:v="urn:schemas-microsoft-com:vml" xmlns:w10="urn:schemas-microsoft-com:office:word" xmlns:w="http://schemas.openxmlformats.org/wordprocessingml/2006/main" xmlns:w14="http://schemas.microsoft.com/office/word/2010/wordml" xmlns:w15="http://schemas.microsoft.com/office/word/2012/wordml" xmlns:w16cex="http://schemas.microsoft.com/office/word/2018/wordml/cex" xmlns:w16cid="http://schemas.microsoft.com/office/word/2016/wordml/cid" xmlns:w16="http://schemas.microsoft.com/office/word/2018/wordml" xmlns:w16du="http://schemas.microsoft.com/office/word/2023/wordml/word16du" xmlns:w16sdtdh="http://schemas.microsoft.com/office/word/2020/wordml/sdtdatahash" xmlns:w16sdtfl="http://schemas.microsoft.com/office/word/2024/wordml/sdtformatlock" xmlns:w16se="http://schemas.microsoft.com/office/word/2015/wordml/symex" xmlns:sl="http://schemas.openxmlformats.org/schemaLibrary/2006/main" mc:Ignorable="w14 w15 w16se w16cid w16 w16cex w16sdtdh w16sdtfl w16du">
   <w:view w:val="normal"/>
   <w:bordersDoNotSurroundHeader/>
   <w:bordersDoNotSurroundFooter/>
@@ -5742,6 +5725,7 @@
     <w:rsid w:val="0065207D"/>
     <w:rsid w:val="00684299"/>
     <w:rsid w:val="0068779C"/>
+    <w:rsid w:val="006F5E27"/>
     <w:rsid w:val="00752D18"/>
     <w:rsid w:val="007E1635"/>
     <w:rsid w:val="007E5123"/>
@@ -5761,6 +5745,7 @@
     <w:rsid w:val="00D72E2D"/>
     <w:rsid w:val="00D815A7"/>
     <w:rsid w:val="00E663A0"/>
+    <w:rsid w:val="00E84EFE"/>
     <w:rsid w:val="00EB4536"/>
     <w:rsid w:val="00EC23BA"/>
     <w:rsid w:val="00EC6BB0"/>
@@ -5783,13 +5768,13 @@
   <w:themeFontLang w:val="en-US" w:eastAsia="zh-CN"/>
   <w:clrSchemeMapping w:bg1="light1" w:t1="dark1" w:bg2="light2" w:t2="dark2" w:accent1="accent1" w:accent2="accent2" w:accent3="accent3" w:accent4="accent4" w:accent5="accent5" w:accent6="accent6" w:hyperlink="hyperlink" w:followedHyperlink="followedHyperlink"/>
   <w:decimalSymbol w:val="."/>
-  <w:listSeparator w:val=";"/>
+  <w:listSeparator w:val=","/>
   <w15:chartTrackingRefBased/>
 </w:settings>
 </file>
 
 <file path=word/glossary/styles.xml><?xml version="1.0" encoding="utf-8"?>
-<w:styles xmlns:mc="http://schemas.openxmlformats.org/markup-compatibility/2006" xmlns:r="http://schemas.openxmlformats.org/officeDocument/2006/relationships" xmlns:w="http://schemas.openxmlformats.org/wordprocessingml/2006/main" xmlns:w14="http://schemas.microsoft.com/office/word/2010/wordml" xmlns:w15="http://schemas.microsoft.com/office/word/2012/wordml" xmlns:w16cex="http://schemas.microsoft.com/office/word/2018/wordml/cex" xmlns:w16cid="http://schemas.microsoft.com/office/word/2016/wordml/cid" xmlns:w16="http://schemas.microsoft.com/office/word/2018/wordml" xmlns:w16du="http://schemas.microsoft.com/office/word/2023/wordml/word16du" xmlns:w16sdtdh="http://schemas.microsoft.com/office/word/2020/wordml/sdtdatahash" xmlns:w16se="http://schemas.microsoft.com/office/word/2015/wordml/symex" mc:Ignorable="w14 w15 w16se w16cid w16 w16cex w16sdtdh w16du">
+<w:styles xmlns:mc="http://schemas.openxmlformats.org/markup-compatibility/2006" xmlns:r="http://schemas.openxmlformats.org/officeDocument/2006/relationships" xmlns:w="http://schemas.openxmlformats.org/wordprocessingml/2006/main" xmlns:w14="http://schemas.microsoft.com/office/word/2010/wordml" xmlns:w15="http://schemas.microsoft.com/office/word/2012/wordml" xmlns:w16cex="http://schemas.microsoft.com/office/word/2018/wordml/cex" xmlns:w16cid="http://schemas.microsoft.com/office/word/2016/wordml/cid" xmlns:w16="http://schemas.microsoft.com/office/word/2018/wordml" xmlns:w16du="http://schemas.microsoft.com/office/word/2023/wordml/word16du" xmlns:w16sdtdh="http://schemas.microsoft.com/office/word/2020/wordml/sdtdatahash" xmlns:w16sdtfl="http://schemas.microsoft.com/office/word/2024/wordml/sdtformatlock" xmlns:w16se="http://schemas.microsoft.com/office/word/2015/wordml/symex" mc:Ignorable="w14 w15 w16se w16cid w16 w16cex w16sdtdh w16sdtfl w16du">
   <w:docDefaults>
     <w:rPrDefault>
       <w:rPr>
@@ -6214,7 +6199,7 @@
     <w:semiHidden/>
     <w:unhideWhenUsed/>
   </w:style>
-  <w:style w:type="character" w:styleId="Textoennegrita">
+  <w:style w:type="character" w:styleId="Fuerte">
     <w:name w:val="Strong"/>
     <w:basedOn w:val="Fuentedeprrafopredeter"/>
     <w:uiPriority w:val="4"/>
@@ -6224,7 +6209,7 @@
       <w:rFonts w:asciiTheme="majorHAnsi" w:hAnsiTheme="majorHAnsi"/>
       <w:b/>
       <w:bCs/>
-      <w:color w:val="ED7D31" w:themeColor="accent2"/>
+      <w:color w:val="E97132" w:themeColor="accent2"/>
       <w:sz w:val="24"/>
     </w:rPr>
   </w:style>
@@ -6256,7 +6241,7 @@
 </file>
 
 <file path=word/glossary/webSettings.xml><?xml version="1.0" encoding="utf-8"?>
-<w:webSettings xmlns:mc="http://schemas.openxmlformats.org/markup-compatibility/2006" xmlns:r="http://schemas.openxmlformats.org/officeDocument/2006/relationships" xmlns:w="http://schemas.openxmlformats.org/wordprocessingml/2006/main" xmlns:w14="http://schemas.microsoft.com/office/word/2010/wordml" xmlns:w15="http://schemas.microsoft.com/office/word/2012/wordml" xmlns:w16cex="http://schemas.microsoft.com/office/word/2018/wordml/cex" xmlns:w16cid="http://schemas.microsoft.com/office/word/2016/wordml/cid" xmlns:w16="http://schemas.microsoft.com/office/word/2018/wordml" xmlns:w16du="http://schemas.microsoft.com/office/word/2023/wordml/word16du" xmlns:w16sdtdh="http://schemas.microsoft.com/office/word/2020/wordml/sdtdatahash" xmlns:w16se="http://schemas.microsoft.com/office/word/2015/wordml/symex" mc:Ignorable="w14 w15 w16se w16cid w16 w16cex w16sdtdh w16du">
+<w:webSettings xmlns:mc="http://schemas.openxmlformats.org/markup-compatibility/2006" xmlns:r="http://schemas.openxmlformats.org/officeDocument/2006/relationships" xmlns:w="http://schemas.openxmlformats.org/wordprocessingml/2006/main" xmlns:w14="http://schemas.microsoft.com/office/word/2010/wordml" xmlns:w15="http://schemas.microsoft.com/office/word/2012/wordml" xmlns:w16cex="http://schemas.microsoft.com/office/word/2018/wordml/cex" xmlns:w16cid="http://schemas.microsoft.com/office/word/2016/wordml/cid" xmlns:w16="http://schemas.microsoft.com/office/word/2018/wordml" xmlns:w16du="http://schemas.microsoft.com/office/word/2023/wordml/word16du" xmlns:w16sdtdh="http://schemas.microsoft.com/office/word/2020/wordml/sdtdatahash" xmlns:w16sdtfl="http://schemas.microsoft.com/office/word/2024/wordml/sdtformatlock" xmlns:w16se="http://schemas.microsoft.com/office/word/2015/wordml/symex" mc:Ignorable="w14 w15 w16se w16cid w16 w16cex w16sdtdh w16sdtfl w16du">
   <w:optimizeForBrowser/>
   <w:allowPNG/>
 </w:webSettings>
@@ -6524,12 +6509,11 @@
 </file>
 
 <file path=customXml/item1.xml><?xml version="1.0" encoding="utf-8"?>
-<?mso-contentType ?>
-<FormTemplates xmlns="http://schemas.microsoft.com/sharepoint/v3/contenttype/forms">
-  <Display>DocumentLibraryForm</Display>
-  <Edit>DocumentLibraryForm</Edit>
-  <New>DocumentLibraryForm</New>
-</FormTemplates>
+<p:properties xmlns:p="http://schemas.microsoft.com/office/2006/metadata/properties" xmlns:xsi="http://www.w3.org/2001/XMLSchema-instance" xmlns:pc="http://schemas.microsoft.com/office/infopath/2007/PartnerControls">
+  <documentManagement>
+    <MediaServiceKeyPoints xmlns="71af3243-3dd4-4a8d-8c0d-dd76da1f02a5" xsi:nil="true"/>
+  </documentManagement>
+</p:properties>
 </file>
 
 <file path=customXml/item2.xml><?xml version="1.0" encoding="utf-8"?>
@@ -6744,17 +6728,20 @@
 </file>
 
 <file path=customXml/item3.xml><?xml version="1.0" encoding="utf-8"?>
-<p:properties xmlns:p="http://schemas.microsoft.com/office/2006/metadata/properties" xmlns:xsi="http://www.w3.org/2001/XMLSchema-instance" xmlns:pc="http://schemas.microsoft.com/office/infopath/2007/PartnerControls">
-  <documentManagement>
-    <MediaServiceKeyPoints xmlns="71af3243-3dd4-4a8d-8c0d-dd76da1f02a5" xsi:nil="true"/>
-  </documentManagement>
-</p:properties>
+<?mso-contentType ?>
+<FormTemplates xmlns="http://schemas.microsoft.com/sharepoint/v3/contenttype/forms">
+  <Display>DocumentLibraryForm</Display>
+  <Edit>DocumentLibraryForm</Edit>
+  <New>DocumentLibraryForm</New>
+</FormTemplates>
 </file>
 
 <file path=customXml/itemProps1.xml><?xml version="1.0" encoding="utf-8"?>
-<ds:datastoreItem xmlns:ds="http://schemas.openxmlformats.org/officeDocument/2006/customXml" ds:itemID="{BEA6D05B-AD60-405F-B8DB-FC61ABCDF8E2}">
+<ds:datastoreItem xmlns:ds="http://schemas.openxmlformats.org/officeDocument/2006/customXml" ds:itemID="{B550BB7C-2FBC-4612-9ECE-2EA076035D14}">
   <ds:schemaRefs>
-    <ds:schemaRef ds:uri="http://schemas.microsoft.com/sharepoint/v3/contenttype/forms"/>
+    <ds:schemaRef ds:uri="http://schemas.microsoft.com/office/2006/metadata/properties"/>
+    <ds:schemaRef ds:uri="http://schemas.microsoft.com/office/infopath/2007/PartnerControls"/>
+    <ds:schemaRef ds:uri="71af3243-3dd4-4a8d-8c0d-dd76da1f02a5"/>
   </ds:schemaRefs>
 </ds:datastoreItem>
 </file>
@@ -6779,11 +6766,9 @@
 </file>
 
 <file path=customXml/itemProps3.xml><?xml version="1.0" encoding="utf-8"?>
-<ds:datastoreItem xmlns:ds="http://schemas.openxmlformats.org/officeDocument/2006/customXml" ds:itemID="{B550BB7C-2FBC-4612-9ECE-2EA076035D14}">
+<ds:datastoreItem xmlns:ds="http://schemas.openxmlformats.org/officeDocument/2006/customXml" ds:itemID="{BEA6D05B-AD60-405F-B8DB-FC61ABCDF8E2}">
   <ds:schemaRefs>
-    <ds:schemaRef ds:uri="http://schemas.microsoft.com/office/2006/metadata/properties"/>
-    <ds:schemaRef ds:uri="http://schemas.microsoft.com/office/infopath/2007/PartnerControls"/>
-    <ds:schemaRef ds:uri="71af3243-3dd4-4a8d-8c0d-dd76da1f02a5"/>
+    <ds:schemaRef ds:uri="http://schemas.microsoft.com/sharepoint/v3/contenttype/forms"/>
   </ds:schemaRefs>
 </ds:datastoreItem>
 </file>
</xml_diff>